<commit_message>
updated backend and frontend features
</commit_message>
<xml_diff>
--- a/app documentatio and ideas.docx
+++ b/app documentatio and ideas.docx
@@ -142,6 +142,9 @@
     <w:p/>
     <w:p>
       <w:r>
+        <w:rPr>
+          <w:noProof/>
+        </w:rPr>
         <w:lastRenderedPageBreak/>
         <w:drawing>
           <wp:inline distT="0" distB="0" distL="0" distR="0" wp14:anchorId="331154E6" wp14:editId="359E253A">
@@ -193,6 +196,9 @@
     </w:p>
     <w:p>
       <w:r>
+        <w:rPr>
+          <w:noProof/>
+        </w:rPr>
         <w:drawing>
           <wp:inline distT="0" distB="0" distL="0" distR="0" wp14:anchorId="5E9DB70B" wp14:editId="1CBDD84F">
             <wp:extent cx="5731510" cy="2904490"/>
@@ -242,6 +248,7 @@
       </w:pPr>
       <w:r>
         <w:rPr>
+          <w:noProof/>
           <w:vertAlign w:val="subscript"/>
         </w:rPr>
         <w:lastRenderedPageBreak/>
@@ -310,6 +317,7 @@
       </w:pPr>
       <w:r>
         <w:rPr>
+          <w:noProof/>
           <w:vertAlign w:val="subscript"/>
         </w:rPr>
         <w:drawing>
@@ -364,6 +372,7 @@
       </w:pPr>
       <w:r>
         <w:rPr>
+          <w:noProof/>
           <w:vertAlign w:val="subscript"/>
         </w:rPr>
         <w:lastRenderedPageBreak/>
@@ -408,9 +417,783 @@
     <w:p/>
     <w:p/>
     <w:p/>
+    <w:tbl>
+      <w:tblPr>
+        <w:tblW w:w="0" w:type="auto"/>
+        <w:tblCellSpacing w:w="15" w:type="dxa"/>
+        <w:tblBorders>
+          <w:top w:val="single" w:sz="2" w:space="0" w:color="auto"/>
+          <w:left w:val="single" w:sz="2" w:space="0" w:color="auto"/>
+          <w:bottom w:val="single" w:sz="2" w:space="0" w:color="auto"/>
+          <w:right w:val="single" w:sz="2" w:space="0" w:color="auto"/>
+        </w:tblBorders>
+        <w:shd w:val="clear" w:color="auto" w:fill="252526"/>
+        <w:tblCellMar>
+          <w:top w:w="15" w:type="dxa"/>
+          <w:left w:w="15" w:type="dxa"/>
+          <w:bottom w:w="15" w:type="dxa"/>
+          <w:right w:w="15" w:type="dxa"/>
+        </w:tblCellMar>
+        <w:tblLook w:val="04A0" w:firstRow="1" w:lastRow="0" w:firstColumn="1" w:lastColumn="0" w:noHBand="0" w:noVBand="1"/>
+      </w:tblPr>
+      <w:tblGrid>
+        <w:gridCol w:w="2524"/>
+        <w:gridCol w:w="6491"/>
+      </w:tblGrid>
+      <w:tr>
+        <w:trPr>
+          <w:tblCellSpacing w:w="15" w:type="dxa"/>
+        </w:trPr>
+        <w:tc>
+          <w:tcPr>
+            <w:tcW w:w="0" w:type="auto"/>
+            <w:tcBorders>
+              <w:top w:val="single" w:sz="6" w:space="0" w:color="auto"/>
+              <w:left w:val="single" w:sz="6" w:space="0" w:color="auto"/>
+              <w:bottom w:val="single" w:sz="6" w:space="0" w:color="auto"/>
+              <w:right w:val="single" w:sz="6" w:space="0" w:color="auto"/>
+            </w:tcBorders>
+            <w:shd w:val="clear" w:color="auto" w:fill="252526"/>
+            <w:vAlign w:val="center"/>
+            <w:hideMark/>
+          </w:tcPr>
+          <w:p>
+            <w:r>
+              <w:rPr>
+                <w:b/>
+                <w:bCs/>
+              </w:rPr>
+              <w:t>Home page hero section</w:t>
+            </w:r>
+          </w:p>
+        </w:tc>
+        <w:tc>
+          <w:tcPr>
+            <w:tcW w:w="0" w:type="auto"/>
+            <w:tcBorders>
+              <w:top w:val="single" w:sz="6" w:space="0" w:color="auto"/>
+              <w:left w:val="single" w:sz="6" w:space="0" w:color="auto"/>
+              <w:bottom w:val="single" w:sz="6" w:space="0" w:color="auto"/>
+              <w:right w:val="single" w:sz="2" w:space="0" w:color="auto"/>
+            </w:tcBorders>
+            <w:shd w:val="clear" w:color="auto" w:fill="252526"/>
+            <w:vAlign w:val="center"/>
+            <w:hideMark/>
+          </w:tcPr>
+          <w:p>
+            <w:r>
+              <w:t>Static dark box → Animated hero with product carousel, subtle motion</w:t>
+            </w:r>
+          </w:p>
+        </w:tc>
+      </w:tr>
+    </w:tbl>
     <w:p/>
     <w:p/>
     <w:p/>
+    <w:tbl>
+      <w:tblPr>
+        <w:tblW w:w="0" w:type="auto"/>
+        <w:tblCellSpacing w:w="15" w:type="dxa"/>
+        <w:tblBorders>
+          <w:top w:val="single" w:sz="2" w:space="0" w:color="auto"/>
+          <w:left w:val="single" w:sz="2" w:space="0" w:color="auto"/>
+          <w:bottom w:val="single" w:sz="2" w:space="0" w:color="auto"/>
+          <w:right w:val="single" w:sz="2" w:space="0" w:color="auto"/>
+        </w:tblBorders>
+        <w:tblCellMar>
+          <w:top w:w="15" w:type="dxa"/>
+          <w:left w:w="15" w:type="dxa"/>
+          <w:bottom w:w="15" w:type="dxa"/>
+          <w:right w:w="15" w:type="dxa"/>
+        </w:tblCellMar>
+        <w:tblLook w:val="04A0" w:firstRow="1" w:lastRow="0" w:firstColumn="1" w:lastColumn="0" w:noHBand="0" w:noVBand="1"/>
+      </w:tblPr>
+      <w:tblGrid>
+        <w:gridCol w:w="224"/>
+        <w:gridCol w:w="1846"/>
+        <w:gridCol w:w="6950"/>
+      </w:tblGrid>
+      <w:tr>
+        <w:trPr>
+          <w:tblCellSpacing w:w="15" w:type="dxa"/>
+        </w:trPr>
+        <w:tc>
+          <w:tcPr>
+            <w:tcW w:w="0" w:type="auto"/>
+            <w:tcBorders>
+              <w:top w:val="single" w:sz="6" w:space="0" w:color="auto"/>
+              <w:left w:val="single" w:sz="2" w:space="0" w:color="auto"/>
+              <w:bottom w:val="single" w:sz="6" w:space="0" w:color="auto"/>
+              <w:right w:val="single" w:sz="6" w:space="0" w:color="auto"/>
+            </w:tcBorders>
+            <w:vAlign w:val="center"/>
+            <w:hideMark/>
+          </w:tcPr>
+          <w:p>
+            <w:r>
+              <w:t>4</w:t>
+            </w:r>
+          </w:p>
+        </w:tc>
+        <w:tc>
+          <w:tcPr>
+            <w:tcW w:w="0" w:type="auto"/>
+            <w:tcBorders>
+              <w:top w:val="single" w:sz="6" w:space="0" w:color="auto"/>
+              <w:left w:val="single" w:sz="6" w:space="0" w:color="auto"/>
+              <w:bottom w:val="single" w:sz="6" w:space="0" w:color="auto"/>
+              <w:right w:val="single" w:sz="6" w:space="0" w:color="auto"/>
+            </w:tcBorders>
+            <w:vAlign w:val="center"/>
+            <w:hideMark/>
+          </w:tcPr>
+          <w:p>
+            <w:r>
+              <w:rPr>
+                <w:b/>
+                <w:bCs/>
+              </w:rPr>
+              <w:t>Product detail page</w:t>
+            </w:r>
+          </w:p>
+        </w:tc>
+        <w:tc>
+          <w:tcPr>
+            <w:tcW w:w="0" w:type="auto"/>
+            <w:tcBorders>
+              <w:top w:val="single" w:sz="6" w:space="0" w:color="auto"/>
+              <w:left w:val="single" w:sz="6" w:space="0" w:color="auto"/>
+              <w:bottom w:val="single" w:sz="6" w:space="0" w:color="auto"/>
+              <w:right w:val="single" w:sz="2" w:space="0" w:color="auto"/>
+            </w:tcBorders>
+            <w:vAlign w:val="center"/>
+            <w:hideMark/>
+          </w:tcPr>
+          <w:p>
+            <w:r>
+              <w:t>Basic → Image zoom, tabbed description/specs, related products section</w:t>
+            </w:r>
+          </w:p>
+        </w:tc>
+      </w:tr>
+      <w:tr>
+        <w:trPr>
+          <w:tblCellSpacing w:w="15" w:type="dxa"/>
+        </w:trPr>
+        <w:tc>
+          <w:tcPr>
+            <w:tcW w:w="0" w:type="auto"/>
+            <w:tcBorders>
+              <w:top w:val="single" w:sz="6" w:space="0" w:color="auto"/>
+              <w:left w:val="single" w:sz="2" w:space="0" w:color="auto"/>
+              <w:bottom w:val="single" w:sz="6" w:space="0" w:color="auto"/>
+              <w:right w:val="single" w:sz="6" w:space="0" w:color="auto"/>
+            </w:tcBorders>
+            <w:vAlign w:val="center"/>
+            <w:hideMark/>
+          </w:tcPr>
+          <w:p>
+            <w:r>
+              <w:t>5</w:t>
+            </w:r>
+          </w:p>
+        </w:tc>
+        <w:tc>
+          <w:tcPr>
+            <w:tcW w:w="0" w:type="auto"/>
+            <w:tcBorders>
+              <w:top w:val="single" w:sz="6" w:space="0" w:color="auto"/>
+              <w:left w:val="single" w:sz="6" w:space="0" w:color="auto"/>
+              <w:bottom w:val="single" w:sz="6" w:space="0" w:color="auto"/>
+              <w:right w:val="single" w:sz="6" w:space="0" w:color="auto"/>
+            </w:tcBorders>
+            <w:vAlign w:val="center"/>
+            <w:hideMark/>
+          </w:tcPr>
+          <w:p>
+            <w:r>
+              <w:rPr>
+                <w:b/>
+                <w:bCs/>
+              </w:rPr>
+              <w:t>Cart page</w:t>
+            </w:r>
+          </w:p>
+        </w:tc>
+        <w:tc>
+          <w:tcPr>
+            <w:tcW w:w="0" w:type="auto"/>
+            <w:tcBorders>
+              <w:top w:val="single" w:sz="6" w:space="0" w:color="auto"/>
+              <w:left w:val="single" w:sz="6" w:space="0" w:color="auto"/>
+              <w:bottom w:val="single" w:sz="6" w:space="0" w:color="auto"/>
+              <w:right w:val="single" w:sz="2" w:space="0" w:color="auto"/>
+            </w:tcBorders>
+            <w:vAlign w:val="center"/>
+            <w:hideMark/>
+          </w:tcPr>
+          <w:p>
+            <w:r>
+              <w:t>Functional but plain → Premium card layout, quantity stepper, estimated delivery</w:t>
+            </w:r>
+          </w:p>
+        </w:tc>
+      </w:tr>
+      <w:tr>
+        <w:trPr>
+          <w:tblCellSpacing w:w="15" w:type="dxa"/>
+        </w:trPr>
+        <w:tc>
+          <w:tcPr>
+            <w:tcW w:w="0" w:type="auto"/>
+            <w:tcBorders>
+              <w:top w:val="single" w:sz="6" w:space="0" w:color="auto"/>
+              <w:left w:val="single" w:sz="2" w:space="0" w:color="auto"/>
+              <w:bottom w:val="single" w:sz="6" w:space="0" w:color="auto"/>
+              <w:right w:val="single" w:sz="6" w:space="0" w:color="auto"/>
+            </w:tcBorders>
+            <w:vAlign w:val="center"/>
+            <w:hideMark/>
+          </w:tcPr>
+          <w:p>
+            <w:r>
+              <w:t>6</w:t>
+            </w:r>
+          </w:p>
+        </w:tc>
+        <w:tc>
+          <w:tcPr>
+            <w:tcW w:w="0" w:type="auto"/>
+            <w:tcBorders>
+              <w:top w:val="single" w:sz="6" w:space="0" w:color="auto"/>
+              <w:left w:val="single" w:sz="6" w:space="0" w:color="auto"/>
+              <w:bottom w:val="single" w:sz="6" w:space="0" w:color="auto"/>
+              <w:right w:val="single" w:sz="6" w:space="0" w:color="auto"/>
+            </w:tcBorders>
+            <w:vAlign w:val="center"/>
+            <w:hideMark/>
+          </w:tcPr>
+          <w:p>
+            <w:r>
+              <w:rPr>
+                <w:b/>
+                <w:bCs/>
+              </w:rPr>
+              <w:t>Order tracking page</w:t>
+            </w:r>
+          </w:p>
+        </w:tc>
+        <w:tc>
+          <w:tcPr>
+            <w:tcW w:w="0" w:type="auto"/>
+            <w:tcBorders>
+              <w:top w:val="single" w:sz="6" w:space="0" w:color="auto"/>
+              <w:left w:val="single" w:sz="6" w:space="0" w:color="auto"/>
+              <w:bottom w:val="single" w:sz="6" w:space="0" w:color="auto"/>
+              <w:right w:val="single" w:sz="2" w:space="0" w:color="auto"/>
+            </w:tcBorders>
+            <w:vAlign w:val="center"/>
+            <w:hideMark/>
+          </w:tcPr>
+          <w:p>
+            <w:r>
+              <w:t>Basic timeline → Animated stepper with progress bar, estimated delivery dates per stage</w:t>
+            </w:r>
+          </w:p>
+        </w:tc>
+      </w:tr>
+      <w:tr>
+        <w:trPr>
+          <w:tblCellSpacing w:w="15" w:type="dxa"/>
+        </w:trPr>
+        <w:tc>
+          <w:tcPr>
+            <w:tcW w:w="0" w:type="auto"/>
+            <w:tcBorders>
+              <w:top w:val="single" w:sz="6" w:space="0" w:color="auto"/>
+              <w:left w:val="single" w:sz="2" w:space="0" w:color="auto"/>
+              <w:bottom w:val="single" w:sz="6" w:space="0" w:color="auto"/>
+              <w:right w:val="single" w:sz="6" w:space="0" w:color="auto"/>
+            </w:tcBorders>
+            <w:vAlign w:val="center"/>
+            <w:hideMark/>
+          </w:tcPr>
+          <w:p>
+            <w:r>
+              <w:t>7</w:t>
+            </w:r>
+          </w:p>
+        </w:tc>
+        <w:tc>
+          <w:tcPr>
+            <w:tcW w:w="0" w:type="auto"/>
+            <w:tcBorders>
+              <w:top w:val="single" w:sz="6" w:space="0" w:color="auto"/>
+              <w:left w:val="single" w:sz="6" w:space="0" w:color="auto"/>
+              <w:bottom w:val="single" w:sz="6" w:space="0" w:color="auto"/>
+              <w:right w:val="single" w:sz="6" w:space="0" w:color="auto"/>
+            </w:tcBorders>
+            <w:vAlign w:val="center"/>
+            <w:hideMark/>
+          </w:tcPr>
+          <w:p>
+            <w:r>
+              <w:rPr>
+                <w:b/>
+                <w:bCs/>
+              </w:rPr>
+              <w:t>Navbar</w:t>
+            </w:r>
+          </w:p>
+        </w:tc>
+        <w:tc>
+          <w:tcPr>
+            <w:tcW w:w="0" w:type="auto"/>
+            <w:tcBorders>
+              <w:top w:val="single" w:sz="6" w:space="0" w:color="auto"/>
+              <w:left w:val="single" w:sz="6" w:space="0" w:color="auto"/>
+              <w:bottom w:val="single" w:sz="6" w:space="0" w:color="auto"/>
+              <w:right w:val="single" w:sz="2" w:space="0" w:color="auto"/>
+            </w:tcBorders>
+            <w:vAlign w:val="center"/>
+            <w:hideMark/>
+          </w:tcPr>
+          <w:p>
+            <w:r>
+              <w:t>Simple links → Sticky with scroll effects, cart badge animation, user dropdown</w:t>
+            </w:r>
+          </w:p>
+        </w:tc>
+      </w:tr>
+      <w:tr>
+        <w:trPr>
+          <w:tblCellSpacing w:w="15" w:type="dxa"/>
+        </w:trPr>
+        <w:tc>
+          <w:tcPr>
+            <w:tcW w:w="0" w:type="auto"/>
+            <w:tcBorders>
+              <w:top w:val="single" w:sz="6" w:space="0" w:color="auto"/>
+              <w:left w:val="single" w:sz="2" w:space="0" w:color="auto"/>
+              <w:bottom w:val="single" w:sz="2" w:space="0" w:color="auto"/>
+              <w:right w:val="single" w:sz="6" w:space="0" w:color="auto"/>
+            </w:tcBorders>
+            <w:vAlign w:val="center"/>
+            <w:hideMark/>
+          </w:tcPr>
+          <w:p>
+            <w:r>
+              <w:lastRenderedPageBreak/>
+              <w:t>8</w:t>
+            </w:r>
+          </w:p>
+        </w:tc>
+        <w:tc>
+          <w:tcPr>
+            <w:tcW w:w="0" w:type="auto"/>
+            <w:tcBorders>
+              <w:top w:val="single" w:sz="6" w:space="0" w:color="auto"/>
+              <w:left w:val="single" w:sz="6" w:space="0" w:color="auto"/>
+              <w:bottom w:val="single" w:sz="2" w:space="0" w:color="auto"/>
+              <w:right w:val="single" w:sz="6" w:space="0" w:color="auto"/>
+            </w:tcBorders>
+            <w:vAlign w:val="center"/>
+            <w:hideMark/>
+          </w:tcPr>
+          <w:p>
+            <w:r>
+              <w:rPr>
+                <w:b/>
+                <w:bCs/>
+              </w:rPr>
+              <w:t>Footer</w:t>
+            </w:r>
+          </w:p>
+        </w:tc>
+        <w:tc>
+          <w:tcPr>
+            <w:tcW w:w="0" w:type="auto"/>
+            <w:tcBorders>
+              <w:top w:val="single" w:sz="6" w:space="0" w:color="auto"/>
+              <w:left w:val="single" w:sz="6" w:space="0" w:color="auto"/>
+              <w:bottom w:val="single" w:sz="2" w:space="0" w:color="auto"/>
+              <w:right w:val="single" w:sz="2" w:space="0" w:color="auto"/>
+            </w:tcBorders>
+            <w:vAlign w:val="center"/>
+            <w:hideMark/>
+          </w:tcPr>
+          <w:p>
+            <w:r>
+              <w:t>Missing entirely → Professional footer with links, social icons, newsletter</w:t>
+            </w:r>
+          </w:p>
+        </w:tc>
+      </w:tr>
+    </w:tbl>
+    <w:p>
+      <w:r>
+        <w:rPr>
+          <w:rFonts w:ascii="Segoe UI Emoji" w:hAnsi="Segoe UI Emoji" w:cs="Segoe UI Emoji"/>
+        </w:rPr>
+        <w:t>🟢</w:t>
+      </w:r>
+      <w:r>
+        <w:t xml:space="preserve"> Priority 3: Standout Features</w:t>
+      </w:r>
+    </w:p>
+    <w:tbl>
+      <w:tblPr>
+        <w:tblW w:w="0" w:type="auto"/>
+        <w:tblCellSpacing w:w="15" w:type="dxa"/>
+        <w:tblBorders>
+          <w:top w:val="single" w:sz="2" w:space="0" w:color="auto"/>
+          <w:left w:val="single" w:sz="2" w:space="0" w:color="auto"/>
+          <w:bottom w:val="single" w:sz="2" w:space="0" w:color="auto"/>
+          <w:right w:val="single" w:sz="2" w:space="0" w:color="auto"/>
+        </w:tblBorders>
+        <w:tblCellMar>
+          <w:top w:w="15" w:type="dxa"/>
+          <w:left w:w="15" w:type="dxa"/>
+          <w:bottom w:w="15" w:type="dxa"/>
+          <w:right w:w="15" w:type="dxa"/>
+        </w:tblCellMar>
+        <w:tblLook w:val="04A0" w:firstRow="1" w:lastRow="0" w:firstColumn="1" w:lastColumn="0" w:noHBand="0" w:noVBand="1"/>
+      </w:tblPr>
+      <w:tblGrid>
+        <w:gridCol w:w="352"/>
+        <w:gridCol w:w="2338"/>
+        <w:gridCol w:w="6330"/>
+      </w:tblGrid>
+      <w:tr>
+        <w:trPr>
+          <w:tblHeader/>
+          <w:tblCellSpacing w:w="15" w:type="dxa"/>
+        </w:trPr>
+        <w:tc>
+          <w:tcPr>
+            <w:tcW w:w="0" w:type="auto"/>
+            <w:tcBorders>
+              <w:top w:val="single" w:sz="2" w:space="0" w:color="auto"/>
+              <w:left w:val="single" w:sz="2" w:space="0" w:color="auto"/>
+              <w:bottom w:val="single" w:sz="6" w:space="0" w:color="auto"/>
+              <w:right w:val="single" w:sz="6" w:space="0" w:color="auto"/>
+            </w:tcBorders>
+            <w:vAlign w:val="center"/>
+            <w:hideMark/>
+          </w:tcPr>
+          <w:p>
+            <w:r>
+              <w:t>#</w:t>
+            </w:r>
+          </w:p>
+        </w:tc>
+        <w:tc>
+          <w:tcPr>
+            <w:tcW w:w="0" w:type="auto"/>
+            <w:tcBorders>
+              <w:top w:val="single" w:sz="2" w:space="0" w:color="auto"/>
+              <w:left w:val="single" w:sz="6" w:space="0" w:color="auto"/>
+              <w:bottom w:val="single" w:sz="6" w:space="0" w:color="auto"/>
+              <w:right w:val="single" w:sz="6" w:space="0" w:color="auto"/>
+            </w:tcBorders>
+            <w:vAlign w:val="center"/>
+            <w:hideMark/>
+          </w:tcPr>
+          <w:p>
+            <w:r>
+              <w:t>Item</w:t>
+            </w:r>
+          </w:p>
+        </w:tc>
+        <w:tc>
+          <w:tcPr>
+            <w:tcW w:w="0" w:type="auto"/>
+            <w:tcBorders>
+              <w:top w:val="single" w:sz="2" w:space="0" w:color="auto"/>
+              <w:left w:val="single" w:sz="6" w:space="0" w:color="auto"/>
+              <w:bottom w:val="single" w:sz="6" w:space="0" w:color="auto"/>
+              <w:right w:val="single" w:sz="2" w:space="0" w:color="auto"/>
+            </w:tcBorders>
+            <w:vAlign w:val="center"/>
+            <w:hideMark/>
+          </w:tcPr>
+          <w:p>
+            <w:r>
+              <w:t>Description</w:t>
+            </w:r>
+          </w:p>
+        </w:tc>
+      </w:tr>
+      <w:tr>
+        <w:trPr>
+          <w:tblCellSpacing w:w="15" w:type="dxa"/>
+        </w:trPr>
+        <w:tc>
+          <w:tcPr>
+            <w:tcW w:w="0" w:type="auto"/>
+            <w:tcBorders>
+              <w:top w:val="single" w:sz="6" w:space="0" w:color="auto"/>
+              <w:left w:val="single" w:sz="2" w:space="0" w:color="auto"/>
+              <w:bottom w:val="single" w:sz="6" w:space="0" w:color="auto"/>
+              <w:right w:val="single" w:sz="6" w:space="0" w:color="auto"/>
+            </w:tcBorders>
+            <w:vAlign w:val="center"/>
+            <w:hideMark/>
+          </w:tcPr>
+          <w:p>
+            <w:r>
+              <w:t>9</w:t>
+            </w:r>
+          </w:p>
+        </w:tc>
+        <w:tc>
+          <w:tcPr>
+            <w:tcW w:w="0" w:type="auto"/>
+            <w:tcBorders>
+              <w:top w:val="single" w:sz="6" w:space="0" w:color="auto"/>
+              <w:left w:val="single" w:sz="6" w:space="0" w:color="auto"/>
+              <w:bottom w:val="single" w:sz="6" w:space="0" w:color="auto"/>
+              <w:right w:val="single" w:sz="6" w:space="0" w:color="auto"/>
+            </w:tcBorders>
+            <w:vAlign w:val="center"/>
+            <w:hideMark/>
+          </w:tcPr>
+          <w:p>
+            <w:r>
+              <w:rPr>
+                <w:b/>
+                <w:bCs/>
+              </w:rPr>
+              <w:t>Order confirmation email</w:t>
+            </w:r>
+          </w:p>
+        </w:tc>
+        <w:tc>
+          <w:tcPr>
+            <w:tcW w:w="0" w:type="auto"/>
+            <w:tcBorders>
+              <w:top w:val="single" w:sz="6" w:space="0" w:color="auto"/>
+              <w:left w:val="single" w:sz="6" w:space="0" w:color="auto"/>
+              <w:bottom w:val="single" w:sz="6" w:space="0" w:color="auto"/>
+              <w:right w:val="single" w:sz="2" w:space="0" w:color="auto"/>
+            </w:tcBorders>
+            <w:vAlign w:val="center"/>
+            <w:hideMark/>
+          </w:tcPr>
+          <w:p>
+            <w:r>
+              <w:t>Send email on order placement using a mail service (</w:t>
+            </w:r>
+            <w:proofErr w:type="spellStart"/>
+            <w:r>
+              <w:t>JavaMailSender</w:t>
+            </w:r>
+            <w:proofErr w:type="spellEnd"/>
+            <w:r>
+              <w:t xml:space="preserve"> or </w:t>
+            </w:r>
+            <w:proofErr w:type="spellStart"/>
+            <w:r>
+              <w:t>EmailJS</w:t>
+            </w:r>
+            <w:proofErr w:type="spellEnd"/>
+            <w:r>
+              <w:t xml:space="preserve"> on frontend)</w:t>
+            </w:r>
+          </w:p>
+        </w:tc>
+      </w:tr>
+      <w:tr>
+        <w:trPr>
+          <w:tblCellSpacing w:w="15" w:type="dxa"/>
+        </w:trPr>
+        <w:tc>
+          <w:tcPr>
+            <w:tcW w:w="0" w:type="auto"/>
+            <w:tcBorders>
+              <w:top w:val="single" w:sz="6" w:space="0" w:color="auto"/>
+              <w:left w:val="single" w:sz="2" w:space="0" w:color="auto"/>
+              <w:bottom w:val="single" w:sz="6" w:space="0" w:color="auto"/>
+              <w:right w:val="single" w:sz="6" w:space="0" w:color="auto"/>
+            </w:tcBorders>
+            <w:vAlign w:val="center"/>
+            <w:hideMark/>
+          </w:tcPr>
+          <w:p>
+            <w:r>
+              <w:t>10</w:t>
+            </w:r>
+          </w:p>
+        </w:tc>
+        <w:tc>
+          <w:tcPr>
+            <w:tcW w:w="0" w:type="auto"/>
+            <w:tcBorders>
+              <w:top w:val="single" w:sz="6" w:space="0" w:color="auto"/>
+              <w:left w:val="single" w:sz="6" w:space="0" w:color="auto"/>
+              <w:bottom w:val="single" w:sz="6" w:space="0" w:color="auto"/>
+              <w:right w:val="single" w:sz="6" w:space="0" w:color="auto"/>
+            </w:tcBorders>
+            <w:vAlign w:val="center"/>
+            <w:hideMark/>
+          </w:tcPr>
+          <w:p>
+            <w:r>
+              <w:rPr>
+                <w:b/>
+                <w:bCs/>
+              </w:rPr>
+              <w:t>Product reviews &amp; ratings</w:t>
+            </w:r>
+          </w:p>
+        </w:tc>
+        <w:tc>
+          <w:tcPr>
+            <w:tcW w:w="0" w:type="auto"/>
+            <w:tcBorders>
+              <w:top w:val="single" w:sz="6" w:space="0" w:color="auto"/>
+              <w:left w:val="single" w:sz="6" w:space="0" w:color="auto"/>
+              <w:bottom w:val="single" w:sz="6" w:space="0" w:color="auto"/>
+              <w:right w:val="single" w:sz="2" w:space="0" w:color="auto"/>
+            </w:tcBorders>
+            <w:vAlign w:val="center"/>
+            <w:hideMark/>
+          </w:tcPr>
+          <w:p>
+            <w:r>
+              <w:t>Star ratings, text reviews from customers who purchased</w:t>
+            </w:r>
+          </w:p>
+        </w:tc>
+      </w:tr>
+      <w:tr>
+        <w:trPr>
+          <w:tblCellSpacing w:w="15" w:type="dxa"/>
+        </w:trPr>
+        <w:tc>
+          <w:tcPr>
+            <w:tcW w:w="0" w:type="auto"/>
+            <w:tcBorders>
+              <w:top w:val="single" w:sz="6" w:space="0" w:color="auto"/>
+              <w:left w:val="single" w:sz="2" w:space="0" w:color="auto"/>
+              <w:bottom w:val="single" w:sz="6" w:space="0" w:color="auto"/>
+              <w:right w:val="single" w:sz="6" w:space="0" w:color="auto"/>
+            </w:tcBorders>
+            <w:vAlign w:val="center"/>
+            <w:hideMark/>
+          </w:tcPr>
+          <w:p>
+            <w:r>
+              <w:t>11</w:t>
+            </w:r>
+          </w:p>
+        </w:tc>
+        <w:tc>
+          <w:tcPr>
+            <w:tcW w:w="0" w:type="auto"/>
+            <w:tcBorders>
+              <w:top w:val="single" w:sz="6" w:space="0" w:color="auto"/>
+              <w:left w:val="single" w:sz="6" w:space="0" w:color="auto"/>
+              <w:bottom w:val="single" w:sz="6" w:space="0" w:color="auto"/>
+              <w:right w:val="single" w:sz="6" w:space="0" w:color="auto"/>
+            </w:tcBorders>
+            <w:vAlign w:val="center"/>
+            <w:hideMark/>
+          </w:tcPr>
+          <w:p>
+            <w:r>
+              <w:rPr>
+                <w:b/>
+                <w:bCs/>
+              </w:rPr>
+              <w:t>Search autocomplete</w:t>
+            </w:r>
+          </w:p>
+        </w:tc>
+        <w:tc>
+          <w:tcPr>
+            <w:tcW w:w="0" w:type="auto"/>
+            <w:tcBorders>
+              <w:top w:val="single" w:sz="6" w:space="0" w:color="auto"/>
+              <w:left w:val="single" w:sz="6" w:space="0" w:color="auto"/>
+              <w:bottom w:val="single" w:sz="6" w:space="0" w:color="auto"/>
+              <w:right w:val="single" w:sz="2" w:space="0" w:color="auto"/>
+            </w:tcBorders>
+            <w:vAlign w:val="center"/>
+            <w:hideMark/>
+          </w:tcPr>
+          <w:p>
+            <w:r>
+              <w:t>Live search suggestions as user types</w:t>
+            </w:r>
+          </w:p>
+        </w:tc>
+      </w:tr>
+      <w:tr>
+        <w:trPr>
+          <w:tblCellSpacing w:w="15" w:type="dxa"/>
+        </w:trPr>
+        <w:tc>
+          <w:tcPr>
+            <w:tcW w:w="0" w:type="auto"/>
+            <w:tcBorders>
+              <w:top w:val="single" w:sz="6" w:space="0" w:color="auto"/>
+              <w:left w:val="single" w:sz="2" w:space="0" w:color="auto"/>
+              <w:bottom w:val="single" w:sz="6" w:space="0" w:color="auto"/>
+              <w:right w:val="single" w:sz="6" w:space="0" w:color="auto"/>
+            </w:tcBorders>
+            <w:vAlign w:val="center"/>
+            <w:hideMark/>
+          </w:tcPr>
+          <w:p>
+            <w:r>
+              <w:t>12</w:t>
+            </w:r>
+          </w:p>
+        </w:tc>
+        <w:tc>
+          <w:tcPr>
+            <w:tcW w:w="0" w:type="auto"/>
+            <w:tcBorders>
+              <w:top w:val="single" w:sz="6" w:space="0" w:color="auto"/>
+              <w:left w:val="single" w:sz="6" w:space="0" w:color="auto"/>
+              <w:bottom w:val="single" w:sz="6" w:space="0" w:color="auto"/>
+              <w:right w:val="single" w:sz="6" w:space="0" w:color="auto"/>
+            </w:tcBorders>
+            <w:vAlign w:val="center"/>
+            <w:hideMark/>
+          </w:tcPr>
+          <w:p>
+            <w:r>
+              <w:rPr>
+                <w:b/>
+                <w:bCs/>
+              </w:rPr>
+              <w:t>Dark mode toggle</w:t>
+            </w:r>
+          </w:p>
+        </w:tc>
+        <w:tc>
+          <w:tcPr>
+            <w:tcW w:w="0" w:type="auto"/>
+            <w:tcBorders>
+              <w:top w:val="single" w:sz="6" w:space="0" w:color="auto"/>
+              <w:left w:val="single" w:sz="6" w:space="0" w:color="auto"/>
+              <w:bottom w:val="single" w:sz="6" w:space="0" w:color="auto"/>
+              <w:right w:val="single" w:sz="2" w:space="0" w:color="auto"/>
+            </w:tcBorders>
+            <w:vAlign w:val="center"/>
+            <w:hideMark/>
+          </w:tcPr>
+          <w:p>
+            <w:r>
+              <w:t>System-aware + manual toggle</w:t>
+            </w:r>
+          </w:p>
+        </w:tc>
+      </w:tr>
+    </w:tbl>
     <w:p/>
     <w:p/>
     <w:p/>
@@ -1028,7 +1811,6 @@
   <w:style w:type="character" w:default="1" w:styleId="DefaultParagraphFont">
     <w:name w:val="Default Paragraph Font"/>
     <w:uiPriority w:val="1"/>
-    <w:semiHidden/>
     <w:unhideWhenUsed/>
   </w:style>
   <w:style w:type="table" w:default="1" w:styleId="TableNormal">

</xml_diff>